<commit_message>
feat: crear app usuarios, cambios el modelo de solicitudes agregando usuarios cmo FK, finalizando con migraciones
</commit_message>
<xml_diff>
--- a/docs/1. INFORME DE SOFTWARE REPORTONE.docx
+++ b/docs/1. INFORME DE SOFTWARE REPORTONE.docx
@@ -1009,6 +1009,7 @@
                 <w:kern w:val="0"/>
                 <w:sz w:val="18"/>
                 <w:szCs w:val="18"/>
+                <w:highlight w:val="yellow"/>
                 <w:lang w:eastAsia="es-CO"/>
                 <w14:ligatures w14:val="none"/>
               </w:rPr>
@@ -1020,6 +1021,7 @@
                 <w:kern w:val="0"/>
                 <w:sz w:val="18"/>
                 <w:szCs w:val="18"/>
+                <w:highlight w:val="yellow"/>
                 <w:lang w:eastAsia="es-CO"/>
                 <w14:ligatures w14:val="none"/>
               </w:rPr>
@@ -1049,6 +1051,7 @@
                 <w:kern w:val="0"/>
                 <w:sz w:val="18"/>
                 <w:szCs w:val="18"/>
+                <w:highlight w:val="yellow"/>
                 <w:lang w:eastAsia="es-CO"/>
                 <w14:ligatures w14:val="none"/>
               </w:rPr>
@@ -1060,6 +1063,7 @@
                 <w:kern w:val="0"/>
                 <w:sz w:val="18"/>
                 <w:szCs w:val="18"/>
+                <w:highlight w:val="yellow"/>
                 <w:lang w:eastAsia="es-CO"/>
                 <w14:ligatures w14:val="none"/>
               </w:rPr>
@@ -1097,6 +1101,7 @@
                 <w:kern w:val="0"/>
                 <w:sz w:val="18"/>
                 <w:szCs w:val="18"/>
+                <w:highlight w:val="yellow"/>
                 <w:lang w:eastAsia="es-CO"/>
                 <w14:ligatures w14:val="none"/>
               </w:rPr>
@@ -1108,6 +1113,7 @@
                 <w:kern w:val="0"/>
                 <w:sz w:val="18"/>
                 <w:szCs w:val="18"/>
+                <w:highlight w:val="yellow"/>
                 <w:lang w:eastAsia="es-CO"/>
                 <w14:ligatures w14:val="none"/>
               </w:rPr>
@@ -1137,6 +1143,7 @@
                 <w:kern w:val="0"/>
                 <w:sz w:val="18"/>
                 <w:szCs w:val="18"/>
+                <w:highlight w:val="yellow"/>
                 <w:lang w:eastAsia="es-CO"/>
                 <w14:ligatures w14:val="none"/>
               </w:rPr>
@@ -1148,6 +1155,7 @@
                 <w:kern w:val="0"/>
                 <w:sz w:val="18"/>
                 <w:szCs w:val="18"/>
+                <w:highlight w:val="yellow"/>
                 <w:lang w:eastAsia="es-CO"/>
                 <w14:ligatures w14:val="none"/>
               </w:rPr>
@@ -1160,6 +1168,7 @@
                 <w:kern w:val="0"/>
                 <w:sz w:val="18"/>
                 <w:szCs w:val="18"/>
+                <w:highlight w:val="yellow"/>
                 <w:lang w:eastAsia="es-CO"/>
                 <w14:ligatures w14:val="none"/>
               </w:rPr>
@@ -1172,6 +1181,7 @@
                 <w:kern w:val="0"/>
                 <w:sz w:val="18"/>
                 <w:szCs w:val="18"/>
+                <w:highlight w:val="yellow"/>
                 <w:lang w:eastAsia="es-CO"/>
                 <w14:ligatures w14:val="none"/>
               </w:rPr>
@@ -1209,6 +1219,7 @@
                 <w:kern w:val="0"/>
                 <w:sz w:val="18"/>
                 <w:szCs w:val="18"/>
+                <w:highlight w:val="yellow"/>
                 <w:lang w:eastAsia="es-CO"/>
                 <w14:ligatures w14:val="none"/>
               </w:rPr>
@@ -1220,6 +1231,7 @@
                 <w:kern w:val="0"/>
                 <w:sz w:val="18"/>
                 <w:szCs w:val="18"/>
+                <w:highlight w:val="yellow"/>
                 <w:lang w:eastAsia="es-CO"/>
                 <w14:ligatures w14:val="none"/>
               </w:rPr>
@@ -1249,6 +1261,7 @@
                 <w:kern w:val="0"/>
                 <w:sz w:val="18"/>
                 <w:szCs w:val="18"/>
+                <w:highlight w:val="yellow"/>
                 <w:lang w:eastAsia="es-CO"/>
                 <w14:ligatures w14:val="none"/>
               </w:rPr>
@@ -1260,6 +1273,7 @@
                 <w:kern w:val="0"/>
                 <w:sz w:val="18"/>
                 <w:szCs w:val="18"/>
+                <w:highlight w:val="yellow"/>
                 <w:lang w:eastAsia="es-CO"/>
                 <w14:ligatures w14:val="none"/>
               </w:rPr>
@@ -1297,6 +1311,7 @@
                 <w:kern w:val="0"/>
                 <w:sz w:val="18"/>
                 <w:szCs w:val="18"/>
+                <w:highlight w:val="yellow"/>
                 <w:lang w:eastAsia="es-CO"/>
                 <w14:ligatures w14:val="none"/>
               </w:rPr>
@@ -1308,6 +1323,7 @@
                 <w:kern w:val="0"/>
                 <w:sz w:val="18"/>
                 <w:szCs w:val="18"/>
+                <w:highlight w:val="yellow"/>
                 <w:lang w:eastAsia="es-CO"/>
                 <w14:ligatures w14:val="none"/>
               </w:rPr>
@@ -1337,6 +1353,7 @@
                 <w:kern w:val="0"/>
                 <w:sz w:val="18"/>
                 <w:szCs w:val="18"/>
+                <w:highlight w:val="yellow"/>
                 <w:lang w:eastAsia="es-CO"/>
                 <w14:ligatures w14:val="none"/>
               </w:rPr>
@@ -1348,6 +1365,7 @@
                 <w:kern w:val="0"/>
                 <w:sz w:val="18"/>
                 <w:szCs w:val="18"/>
+                <w:highlight w:val="yellow"/>
                 <w:lang w:eastAsia="es-CO"/>
                 <w14:ligatures w14:val="none"/>
               </w:rPr>
@@ -1385,6 +1403,7 @@
                 <w:kern w:val="0"/>
                 <w:sz w:val="18"/>
                 <w:szCs w:val="18"/>
+                <w:highlight w:val="yellow"/>
                 <w:lang w:eastAsia="es-CO"/>
                 <w14:ligatures w14:val="none"/>
               </w:rPr>
@@ -1396,6 +1415,7 @@
                 <w:kern w:val="0"/>
                 <w:sz w:val="18"/>
                 <w:szCs w:val="18"/>
+                <w:highlight w:val="yellow"/>
                 <w:lang w:eastAsia="es-CO"/>
                 <w14:ligatures w14:val="none"/>
               </w:rPr>
@@ -1425,6 +1445,7 @@
                 <w:kern w:val="0"/>
                 <w:sz w:val="18"/>
                 <w:szCs w:val="18"/>
+                <w:highlight w:val="yellow"/>
                 <w:lang w:eastAsia="es-CO"/>
                 <w14:ligatures w14:val="none"/>
               </w:rPr>
@@ -1436,6 +1457,7 @@
                 <w:kern w:val="0"/>
                 <w:sz w:val="18"/>
                 <w:szCs w:val="18"/>
+                <w:highlight w:val="yellow"/>
                 <w:lang w:eastAsia="es-CO"/>
                 <w14:ligatures w14:val="none"/>
               </w:rPr>
@@ -1611,6 +1633,7 @@
                 <w:kern w:val="0"/>
                 <w:sz w:val="18"/>
                 <w:szCs w:val="18"/>
+                <w:highlight w:val="yellow"/>
                 <w:lang w:eastAsia="es-CO"/>
                 <w14:ligatures w14:val="none"/>
               </w:rPr>
@@ -1622,6 +1645,7 @@
                 <w:kern w:val="0"/>
                 <w:sz w:val="18"/>
                 <w:szCs w:val="18"/>
+                <w:highlight w:val="yellow"/>
                 <w:lang w:eastAsia="es-CO"/>
                 <w14:ligatures w14:val="none"/>
               </w:rPr>
@@ -1651,6 +1675,7 @@
                 <w:kern w:val="0"/>
                 <w:sz w:val="18"/>
                 <w:szCs w:val="18"/>
+                <w:highlight w:val="yellow"/>
                 <w:lang w:eastAsia="es-CO"/>
                 <w14:ligatures w14:val="none"/>
               </w:rPr>
@@ -1662,6 +1687,7 @@
                 <w:kern w:val="0"/>
                 <w:sz w:val="18"/>
                 <w:szCs w:val="18"/>
+                <w:highlight w:val="yellow"/>
                 <w:lang w:eastAsia="es-CO"/>
                 <w14:ligatures w14:val="none"/>
               </w:rPr>
@@ -2365,6 +2391,7 @@
                 <w:kern w:val="0"/>
                 <w:sz w:val="18"/>
                 <w:szCs w:val="18"/>
+                <w:highlight w:val="yellow"/>
                 <w:lang w:eastAsia="es-CO"/>
                 <w14:ligatures w14:val="none"/>
               </w:rPr>
@@ -2376,6 +2403,7 @@
                 <w:kern w:val="0"/>
                 <w:sz w:val="18"/>
                 <w:szCs w:val="18"/>
+                <w:highlight w:val="yellow"/>
                 <w:lang w:eastAsia="es-CO"/>
                 <w14:ligatures w14:val="none"/>
               </w:rPr>
@@ -2405,6 +2433,7 @@
                 <w:kern w:val="0"/>
                 <w:sz w:val="18"/>
                 <w:szCs w:val="18"/>
+                <w:highlight w:val="yellow"/>
                 <w:lang w:eastAsia="es-CO"/>
                 <w14:ligatures w14:val="none"/>
               </w:rPr>
@@ -2416,6 +2445,7 @@
                 <w:kern w:val="0"/>
                 <w:sz w:val="18"/>
                 <w:szCs w:val="18"/>
+                <w:highlight w:val="yellow"/>
                 <w:lang w:eastAsia="es-CO"/>
                 <w14:ligatures w14:val="none"/>
               </w:rPr>
@@ -2767,6 +2797,7 @@
                 <w:kern w:val="0"/>
                 <w:sz w:val="18"/>
                 <w:szCs w:val="18"/>
+                <w:highlight w:val="yellow"/>
                 <w:lang w:eastAsia="es-CO"/>
                 <w14:ligatures w14:val="none"/>
               </w:rPr>
@@ -2778,6 +2809,7 @@
                 <w:kern w:val="0"/>
                 <w:sz w:val="18"/>
                 <w:szCs w:val="18"/>
+                <w:highlight w:val="yellow"/>
                 <w:lang w:eastAsia="es-CO"/>
                 <w14:ligatures w14:val="none"/>
               </w:rPr>
@@ -2807,6 +2839,7 @@
                 <w:kern w:val="0"/>
                 <w:sz w:val="18"/>
                 <w:szCs w:val="18"/>
+                <w:highlight w:val="yellow"/>
                 <w:lang w:eastAsia="es-CO"/>
                 <w14:ligatures w14:val="none"/>
               </w:rPr>
@@ -2818,6 +2851,7 @@
                 <w:kern w:val="0"/>
                 <w:sz w:val="18"/>
                 <w:szCs w:val="18"/>
+                <w:highlight w:val="yellow"/>
                 <w:lang w:eastAsia="es-CO"/>
                 <w14:ligatures w14:val="none"/>
               </w:rPr>
@@ -2855,6 +2889,7 @@
                 <w:kern w:val="0"/>
                 <w:sz w:val="18"/>
                 <w:szCs w:val="18"/>
+                <w:highlight w:val="yellow"/>
                 <w:lang w:eastAsia="es-CO"/>
                 <w14:ligatures w14:val="none"/>
               </w:rPr>
@@ -2866,6 +2901,7 @@
                 <w:kern w:val="0"/>
                 <w:sz w:val="18"/>
                 <w:szCs w:val="18"/>
+                <w:highlight w:val="yellow"/>
                 <w:lang w:eastAsia="es-CO"/>
                 <w14:ligatures w14:val="none"/>
               </w:rPr>
@@ -2895,6 +2931,7 @@
                 <w:kern w:val="0"/>
                 <w:sz w:val="18"/>
                 <w:szCs w:val="18"/>
+                <w:highlight w:val="yellow"/>
                 <w:lang w:eastAsia="es-CO"/>
                 <w14:ligatures w14:val="none"/>
               </w:rPr>
@@ -2906,6 +2943,7 @@
                 <w:kern w:val="0"/>
                 <w:sz w:val="18"/>
                 <w:szCs w:val="18"/>
+                <w:highlight w:val="yellow"/>
                 <w:lang w:eastAsia="es-CO"/>
                 <w14:ligatures w14:val="none"/>
               </w:rPr>
@@ -2943,6 +2981,7 @@
                 <w:kern w:val="0"/>
                 <w:sz w:val="18"/>
                 <w:szCs w:val="18"/>
+                <w:highlight w:val="yellow"/>
                 <w:lang w:eastAsia="es-CO"/>
                 <w14:ligatures w14:val="none"/>
               </w:rPr>
@@ -2954,6 +2993,7 @@
                 <w:kern w:val="0"/>
                 <w:sz w:val="18"/>
                 <w:szCs w:val="18"/>
+                <w:highlight w:val="yellow"/>
                 <w:lang w:eastAsia="es-CO"/>
                 <w14:ligatures w14:val="none"/>
               </w:rPr>
@@ -2983,6 +3023,7 @@
                 <w:kern w:val="0"/>
                 <w:sz w:val="18"/>
                 <w:szCs w:val="18"/>
+                <w:highlight w:val="yellow"/>
                 <w:lang w:eastAsia="es-CO"/>
                 <w14:ligatures w14:val="none"/>
               </w:rPr>
@@ -2994,6 +3035,7 @@
                 <w:kern w:val="0"/>
                 <w:sz w:val="18"/>
                 <w:szCs w:val="18"/>
+                <w:highlight w:val="yellow"/>
                 <w:lang w:eastAsia="es-CO"/>
                 <w14:ligatures w14:val="none"/>
               </w:rPr>
@@ -3031,6 +3073,7 @@
                 <w:kern w:val="0"/>
                 <w:sz w:val="18"/>
                 <w:szCs w:val="18"/>
+                <w:highlight w:val="yellow"/>
                 <w:lang w:eastAsia="es-CO"/>
                 <w14:ligatures w14:val="none"/>
               </w:rPr>
@@ -3042,6 +3085,7 @@
                 <w:kern w:val="0"/>
                 <w:sz w:val="18"/>
                 <w:szCs w:val="18"/>
+                <w:highlight w:val="yellow"/>
                 <w:lang w:eastAsia="es-CO"/>
                 <w14:ligatures w14:val="none"/>
               </w:rPr>
@@ -3071,6 +3115,7 @@
                 <w:kern w:val="0"/>
                 <w:sz w:val="18"/>
                 <w:szCs w:val="18"/>
+                <w:highlight w:val="yellow"/>
                 <w:lang w:eastAsia="es-CO"/>
                 <w14:ligatures w14:val="none"/>
               </w:rPr>
@@ -3082,6 +3127,7 @@
                 <w:kern w:val="0"/>
                 <w:sz w:val="18"/>
                 <w:szCs w:val="18"/>
+                <w:highlight w:val="yellow"/>
                 <w:lang w:eastAsia="es-CO"/>
                 <w14:ligatures w14:val="none"/>
               </w:rPr>
@@ -3119,6 +3165,7 @@
                 <w:kern w:val="0"/>
                 <w:sz w:val="18"/>
                 <w:szCs w:val="18"/>
+                <w:highlight w:val="yellow"/>
                 <w:lang w:eastAsia="es-CO"/>
                 <w14:ligatures w14:val="none"/>
               </w:rPr>
@@ -3130,6 +3177,7 @@
                 <w:kern w:val="0"/>
                 <w:sz w:val="18"/>
                 <w:szCs w:val="18"/>
+                <w:highlight w:val="yellow"/>
                 <w:lang w:eastAsia="es-CO"/>
                 <w14:ligatures w14:val="none"/>
               </w:rPr>
@@ -3159,6 +3207,7 @@
                 <w:kern w:val="0"/>
                 <w:sz w:val="18"/>
                 <w:szCs w:val="18"/>
+                <w:highlight w:val="yellow"/>
                 <w:lang w:eastAsia="es-CO"/>
                 <w14:ligatures w14:val="none"/>
               </w:rPr>
@@ -3170,6 +3219,7 @@
                 <w:kern w:val="0"/>
                 <w:sz w:val="18"/>
                 <w:szCs w:val="18"/>
+                <w:highlight w:val="yellow"/>
                 <w:lang w:eastAsia="es-CO"/>
                 <w14:ligatures w14:val="none"/>
               </w:rPr>
@@ -3209,6 +3259,7 @@
                 <w:kern w:val="0"/>
                 <w:sz w:val="18"/>
                 <w:szCs w:val="18"/>
+                <w:highlight w:val="yellow"/>
                 <w:lang w:eastAsia="es-CO"/>
                 <w14:ligatures w14:val="none"/>
               </w:rPr>
@@ -3220,6 +3271,7 @@
                 <w:kern w:val="0"/>
                 <w:sz w:val="18"/>
                 <w:szCs w:val="18"/>
+                <w:highlight w:val="yellow"/>
                 <w:lang w:eastAsia="es-CO"/>
                 <w14:ligatures w14:val="none"/>
               </w:rPr>
@@ -3257,6 +3309,7 @@
                 <w:kern w:val="0"/>
                 <w:sz w:val="18"/>
                 <w:szCs w:val="18"/>
+                <w:highlight w:val="yellow"/>
                 <w:lang w:eastAsia="es-CO"/>
                 <w14:ligatures w14:val="none"/>
               </w:rPr>
@@ -3268,6 +3321,7 @@
                 <w:kern w:val="0"/>
                 <w:sz w:val="18"/>
                 <w:szCs w:val="18"/>
+                <w:highlight w:val="yellow"/>
                 <w:lang w:eastAsia="es-CO"/>
                 <w14:ligatures w14:val="none"/>
               </w:rPr>
@@ -3297,6 +3351,7 @@
                 <w:kern w:val="0"/>
                 <w:sz w:val="18"/>
                 <w:szCs w:val="18"/>
+                <w:highlight w:val="yellow"/>
                 <w:lang w:eastAsia="es-CO"/>
                 <w14:ligatures w14:val="none"/>
               </w:rPr>
@@ -3308,6 +3363,7 @@
                 <w:kern w:val="0"/>
                 <w:sz w:val="18"/>
                 <w:szCs w:val="18"/>
+                <w:highlight w:val="yellow"/>
                 <w:lang w:eastAsia="es-CO"/>
                 <w14:ligatures w14:val="none"/>
               </w:rPr>
@@ -3345,6 +3401,7 @@
                 <w:kern w:val="0"/>
                 <w:sz w:val="18"/>
                 <w:szCs w:val="18"/>
+                <w:highlight w:val="yellow"/>
                 <w:lang w:eastAsia="es-CO"/>
                 <w14:ligatures w14:val="none"/>
               </w:rPr>
@@ -3356,6 +3413,7 @@
                 <w:kern w:val="0"/>
                 <w:sz w:val="18"/>
                 <w:szCs w:val="18"/>
+                <w:highlight w:val="yellow"/>
                 <w:lang w:eastAsia="es-CO"/>
                 <w14:ligatures w14:val="none"/>
               </w:rPr>
@@ -3385,6 +3443,7 @@
                 <w:kern w:val="0"/>
                 <w:sz w:val="18"/>
                 <w:szCs w:val="18"/>
+                <w:highlight w:val="yellow"/>
                 <w:lang w:eastAsia="es-CO"/>
                 <w14:ligatures w14:val="none"/>
               </w:rPr>
@@ -3396,6 +3455,7 @@
                 <w:kern w:val="0"/>
                 <w:sz w:val="18"/>
                 <w:szCs w:val="18"/>
+                <w:highlight w:val="yellow"/>
                 <w:lang w:eastAsia="es-CO"/>
                 <w14:ligatures w14:val="none"/>
               </w:rPr>
@@ -3406,7 +3466,7 @@
       </w:tr>
       <w:tr>
         <w:trPr>
-          <w:trHeight w:val="480"/>
+          <w:trHeight w:val="58"/>
           <w:jc w:val="center"/>
         </w:trPr>
         <w:tc>
@@ -3433,6 +3493,7 @@
                 <w:kern w:val="0"/>
                 <w:sz w:val="18"/>
                 <w:szCs w:val="18"/>
+                <w:highlight w:val="yellow"/>
                 <w:lang w:eastAsia="es-CO"/>
                 <w14:ligatures w14:val="none"/>
               </w:rPr>
@@ -3444,6 +3505,7 @@
                 <w:kern w:val="0"/>
                 <w:sz w:val="18"/>
                 <w:szCs w:val="18"/>
+                <w:highlight w:val="yellow"/>
                 <w:lang w:eastAsia="es-CO"/>
                 <w14:ligatures w14:val="none"/>
               </w:rPr>
@@ -3473,6 +3535,7 @@
                 <w:kern w:val="0"/>
                 <w:sz w:val="18"/>
                 <w:szCs w:val="18"/>
+                <w:highlight w:val="yellow"/>
                 <w:lang w:eastAsia="es-CO"/>
                 <w14:ligatures w14:val="none"/>
               </w:rPr>
@@ -3484,6 +3547,7 @@
                 <w:kern w:val="0"/>
                 <w:sz w:val="18"/>
                 <w:szCs w:val="18"/>
+                <w:highlight w:val="yellow"/>
                 <w:lang w:eastAsia="es-CO"/>
                 <w14:ligatures w14:val="none"/>
               </w:rPr>
@@ -5672,21 +5736,7 @@
         <w:rPr>
           <w:highlight w:val="yellow"/>
         </w:rPr>
-        <w:t xml:space="preserve">Dar </w:t>
-      </w:r>
-      <w:proofErr w:type="gramStart"/>
-      <w:r>
-        <w:rPr>
-          <w:highlight w:val="yellow"/>
-        </w:rPr>
-        <w:t>click</w:t>
-      </w:r>
-      <w:proofErr w:type="gramEnd"/>
-      <w:r>
-        <w:rPr>
-          <w:highlight w:val="yellow"/>
-        </w:rPr>
-        <w:t xml:space="preserve"> a gestión de novedades en el panel de control.</w:t>
+        <w:t>Dar click a gestión de novedades en el panel de control.</w:t>
       </w:r>
     </w:p>
     <w:p>
@@ -5800,21 +5850,7 @@
         <w:rPr>
           <w:highlight w:val="yellow"/>
         </w:rPr>
-        <w:t xml:space="preserve">Hacer </w:t>
-      </w:r>
-      <w:proofErr w:type="gramStart"/>
-      <w:r>
-        <w:rPr>
-          <w:highlight w:val="yellow"/>
-        </w:rPr>
-        <w:t>click</w:t>
-      </w:r>
-      <w:proofErr w:type="gramEnd"/>
-      <w:r>
-        <w:rPr>
-          <w:highlight w:val="yellow"/>
-        </w:rPr>
-        <w:t xml:space="preserve"> en el número de orden, para que se expanda toda la información de la falla.  </w:t>
+        <w:t xml:space="preserve">Hacer click en el número de orden, para que se expanda toda la información de la falla.  </w:t>
       </w:r>
     </w:p>
     <w:p>
@@ -6003,21 +6039,7 @@
         <w:rPr>
           <w:highlight w:val="yellow"/>
         </w:rPr>
-        <w:t xml:space="preserve">Dar </w:t>
-      </w:r>
-      <w:proofErr w:type="gramStart"/>
-      <w:r>
-        <w:rPr>
-          <w:highlight w:val="yellow"/>
-        </w:rPr>
-        <w:t>click</w:t>
-      </w:r>
-      <w:proofErr w:type="gramEnd"/>
-      <w:r>
-        <w:rPr>
-          <w:highlight w:val="yellow"/>
-        </w:rPr>
-        <w:t xml:space="preserve"> a consulta de documentación en el panel de control.</w:t>
+        <w:t>Dar click a consulta de documentación en el panel de control.</w:t>
       </w:r>
     </w:p>
     <w:p>
@@ -6131,35 +6153,7 @@
         <w:rPr>
           <w:highlight w:val="yellow"/>
         </w:rPr>
-        <w:t xml:space="preserve">Hacer </w:t>
-      </w:r>
-      <w:proofErr w:type="gramStart"/>
-      <w:r>
-        <w:rPr>
-          <w:highlight w:val="yellow"/>
-        </w:rPr>
-        <w:t>click</w:t>
-      </w:r>
-      <w:proofErr w:type="gramEnd"/>
-      <w:r>
-        <w:rPr>
-          <w:highlight w:val="yellow"/>
-        </w:rPr>
-        <w:t xml:space="preserve"> en el </w:t>
-      </w:r>
-      <w:proofErr w:type="gramStart"/>
-      <w:r>
-        <w:rPr>
-          <w:highlight w:val="yellow"/>
-        </w:rPr>
-        <w:t>link</w:t>
-      </w:r>
-      <w:proofErr w:type="gramEnd"/>
-      <w:r>
-        <w:rPr>
-          <w:highlight w:val="yellow"/>
-        </w:rPr>
-        <w:t xml:space="preserve"> de visualizar </w:t>
+        <w:t xml:space="preserve">Hacer click en el link de visualizar </w:t>
       </w:r>
       <w:r>
         <w:rPr>
@@ -14026,6 +14020,7 @@
   <w:style w:type="character" w:default="1" w:styleId="Fuentedeprrafopredeter">
     <w:name w:val="Default Paragraph Font"/>
     <w:uiPriority w:val="1"/>
+    <w:semiHidden/>
     <w:unhideWhenUsed/>
   </w:style>
   <w:style w:type="table" w:default="1" w:styleId="Tablanormal">

</xml_diff>

<commit_message>
Add migrations to alter 'criticidad' field and add 'eliminado' field to 'solicitud' model
- Updated 'criticidad' field to include new choices and set default to 'Baja'.
- Introduced 'eliminado' field as a Boolean to track deletion status.
</commit_message>
<xml_diff>
--- a/docs/1. INFORME DE SOFTWARE REPORTONE.docx
+++ b/docs/1. INFORME DE SOFTWARE REPORTONE.docx
@@ -1365,7 +1365,6 @@
                 <w:kern w:val="0"/>
                 <w:sz w:val="18"/>
                 <w:szCs w:val="18"/>
-                <w:highlight w:val="yellow"/>
                 <w:lang w:eastAsia="es-CO"/>
                 <w14:ligatures w14:val="none"/>
               </w:rPr>
@@ -1585,6 +1584,7 @@
                 <w:kern w:val="0"/>
                 <w:sz w:val="18"/>
                 <w:szCs w:val="18"/>
+                <w:highlight w:val="yellow"/>
                 <w:lang w:eastAsia="es-CO"/>
                 <w14:ligatures w14:val="none"/>
               </w:rPr>
@@ -1596,6 +1596,7 @@
                 <w:kern w:val="0"/>
                 <w:sz w:val="18"/>
                 <w:szCs w:val="18"/>
+                <w:highlight w:val="yellow"/>
                 <w:lang w:eastAsia="es-CO"/>
                 <w14:ligatures w14:val="none"/>
               </w:rPr>
@@ -1765,6 +1766,7 @@
                 <w:kern w:val="0"/>
                 <w:sz w:val="18"/>
                 <w:szCs w:val="18"/>
+                <w:highlight w:val="yellow"/>
                 <w:lang w:eastAsia="es-CO"/>
                 <w14:ligatures w14:val="none"/>
               </w:rPr>
@@ -1776,6 +1778,7 @@
                 <w:kern w:val="0"/>
                 <w:sz w:val="18"/>
                 <w:szCs w:val="18"/>
+                <w:highlight w:val="yellow"/>
                 <w:lang w:eastAsia="es-CO"/>
                 <w14:ligatures w14:val="none"/>
               </w:rPr>
@@ -1853,6 +1856,7 @@
                 <w:kern w:val="0"/>
                 <w:sz w:val="18"/>
                 <w:szCs w:val="18"/>
+                <w:highlight w:val="yellow"/>
                 <w:lang w:eastAsia="es-CO"/>
                 <w14:ligatures w14:val="none"/>
               </w:rPr>
@@ -1864,6 +1868,7 @@
                 <w:kern w:val="0"/>
                 <w:sz w:val="18"/>
                 <w:szCs w:val="18"/>
+                <w:highlight w:val="yellow"/>
                 <w:lang w:eastAsia="es-CO"/>
                 <w14:ligatures w14:val="none"/>
               </w:rPr>
@@ -1941,6 +1946,7 @@
                 <w:kern w:val="0"/>
                 <w:sz w:val="18"/>
                 <w:szCs w:val="18"/>
+                <w:highlight w:val="yellow"/>
                 <w:lang w:eastAsia="es-CO"/>
                 <w14:ligatures w14:val="none"/>
               </w:rPr>
@@ -1952,6 +1958,7 @@
                 <w:kern w:val="0"/>
                 <w:sz w:val="18"/>
                 <w:szCs w:val="18"/>
+                <w:highlight w:val="yellow"/>
                 <w:lang w:eastAsia="es-CO"/>
                 <w14:ligatures w14:val="none"/>
               </w:rPr>
@@ -2029,6 +2036,7 @@
                 <w:kern w:val="0"/>
                 <w:sz w:val="18"/>
                 <w:szCs w:val="18"/>
+                <w:highlight w:val="yellow"/>
                 <w:lang w:eastAsia="es-CO"/>
                 <w14:ligatures w14:val="none"/>
               </w:rPr>
@@ -2040,6 +2048,7 @@
                 <w:kern w:val="0"/>
                 <w:sz w:val="18"/>
                 <w:szCs w:val="18"/>
+                <w:highlight w:val="yellow"/>
                 <w:lang w:eastAsia="es-CO"/>
                 <w14:ligatures w14:val="none"/>
               </w:rPr>
@@ -2117,6 +2126,7 @@
                 <w:kern w:val="0"/>
                 <w:sz w:val="18"/>
                 <w:szCs w:val="18"/>
+                <w:highlight w:val="yellow"/>
                 <w:lang w:eastAsia="es-CO"/>
                 <w14:ligatures w14:val="none"/>
               </w:rPr>
@@ -2128,6 +2138,7 @@
                 <w:kern w:val="0"/>
                 <w:sz w:val="18"/>
                 <w:szCs w:val="18"/>
+                <w:highlight w:val="yellow"/>
                 <w:lang w:eastAsia="es-CO"/>
                 <w14:ligatures w14:val="none"/>
               </w:rPr>
@@ -2255,6 +2266,7 @@
                 <w:kern w:val="0"/>
                 <w:sz w:val="18"/>
                 <w:szCs w:val="18"/>
+                <w:highlight w:val="yellow"/>
                 <w:lang w:eastAsia="es-CO"/>
                 <w14:ligatures w14:val="none"/>
               </w:rPr>
@@ -2266,6 +2278,7 @@
                 <w:kern w:val="0"/>
                 <w:sz w:val="18"/>
                 <w:szCs w:val="18"/>
+                <w:highlight w:val="yellow"/>
                 <w:lang w:eastAsia="es-CO"/>
                 <w14:ligatures w14:val="none"/>
               </w:rPr>
@@ -2343,6 +2356,7 @@
                 <w:kern w:val="0"/>
                 <w:sz w:val="18"/>
                 <w:szCs w:val="18"/>
+                <w:highlight w:val="yellow"/>
                 <w:lang w:eastAsia="es-CO"/>
                 <w14:ligatures w14:val="none"/>
               </w:rPr>
@@ -2354,6 +2368,7 @@
                 <w:kern w:val="0"/>
                 <w:sz w:val="18"/>
                 <w:szCs w:val="18"/>
+                <w:highlight w:val="yellow"/>
                 <w:lang w:eastAsia="es-CO"/>
                 <w14:ligatures w14:val="none"/>
               </w:rPr>
@@ -2523,6 +2538,7 @@
                 <w:kern w:val="0"/>
                 <w:sz w:val="18"/>
                 <w:szCs w:val="18"/>
+                <w:highlight w:val="yellow"/>
                 <w:lang w:eastAsia="es-CO"/>
                 <w14:ligatures w14:val="none"/>
               </w:rPr>
@@ -2534,6 +2550,7 @@
                 <w:kern w:val="0"/>
                 <w:sz w:val="18"/>
                 <w:szCs w:val="18"/>
+                <w:highlight w:val="yellow"/>
                 <w:lang w:eastAsia="es-CO"/>
                 <w14:ligatures w14:val="none"/>
               </w:rPr>
@@ -2611,6 +2628,7 @@
                 <w:kern w:val="0"/>
                 <w:sz w:val="18"/>
                 <w:szCs w:val="18"/>
+                <w:highlight w:val="yellow"/>
                 <w:lang w:eastAsia="es-CO"/>
                 <w14:ligatures w14:val="none"/>
               </w:rPr>
@@ -2622,6 +2640,7 @@
                 <w:kern w:val="0"/>
                 <w:sz w:val="18"/>
                 <w:szCs w:val="18"/>
+                <w:highlight w:val="yellow"/>
                 <w:lang w:eastAsia="es-CO"/>
                 <w14:ligatures w14:val="none"/>
               </w:rPr>
@@ -2699,6 +2718,7 @@
                 <w:kern w:val="0"/>
                 <w:sz w:val="18"/>
                 <w:szCs w:val="18"/>
+                <w:highlight w:val="yellow"/>
                 <w:lang w:eastAsia="es-CO"/>
                 <w14:ligatures w14:val="none"/>
               </w:rPr>
@@ -2710,6 +2730,7 @@
                 <w:kern w:val="0"/>
                 <w:sz w:val="18"/>
                 <w:szCs w:val="18"/>
+                <w:highlight w:val="yellow"/>
                 <w:lang w:eastAsia="es-CO"/>
                 <w14:ligatures w14:val="none"/>
               </w:rPr>
@@ -3259,7 +3280,6 @@
                 <w:kern w:val="0"/>
                 <w:sz w:val="18"/>
                 <w:szCs w:val="18"/>
-                <w:highlight w:val="yellow"/>
                 <w:lang w:eastAsia="es-CO"/>
                 <w14:ligatures w14:val="none"/>
               </w:rPr>
@@ -3271,7 +3291,6 @@
                 <w:kern w:val="0"/>
                 <w:sz w:val="18"/>
                 <w:szCs w:val="18"/>
-                <w:highlight w:val="yellow"/>
                 <w:lang w:eastAsia="es-CO"/>
                 <w14:ligatures w14:val="none"/>
               </w:rPr>
@@ -3309,7 +3328,6 @@
                 <w:kern w:val="0"/>
                 <w:sz w:val="18"/>
                 <w:szCs w:val="18"/>
-                <w:highlight w:val="yellow"/>
                 <w:lang w:eastAsia="es-CO"/>
                 <w14:ligatures w14:val="none"/>
               </w:rPr>
@@ -3321,7 +3339,6 @@
                 <w:kern w:val="0"/>
                 <w:sz w:val="18"/>
                 <w:szCs w:val="18"/>
-                <w:highlight w:val="yellow"/>
                 <w:lang w:eastAsia="es-CO"/>
                 <w14:ligatures w14:val="none"/>
               </w:rPr>
@@ -3351,7 +3368,6 @@
                 <w:kern w:val="0"/>
                 <w:sz w:val="18"/>
                 <w:szCs w:val="18"/>
-                <w:highlight w:val="yellow"/>
                 <w:lang w:eastAsia="es-CO"/>
                 <w14:ligatures w14:val="none"/>
               </w:rPr>
@@ -3363,7 +3379,6 @@
                 <w:kern w:val="0"/>
                 <w:sz w:val="18"/>
                 <w:szCs w:val="18"/>
-                <w:highlight w:val="yellow"/>
                 <w:lang w:eastAsia="es-CO"/>
                 <w14:ligatures w14:val="none"/>
               </w:rPr>
@@ -3401,7 +3416,6 @@
                 <w:kern w:val="0"/>
                 <w:sz w:val="18"/>
                 <w:szCs w:val="18"/>
-                <w:highlight w:val="yellow"/>
                 <w:lang w:eastAsia="es-CO"/>
                 <w14:ligatures w14:val="none"/>
               </w:rPr>
@@ -3413,7 +3427,6 @@
                 <w:kern w:val="0"/>
                 <w:sz w:val="18"/>
                 <w:szCs w:val="18"/>
-                <w:highlight w:val="yellow"/>
                 <w:lang w:eastAsia="es-CO"/>
                 <w14:ligatures w14:val="none"/>
               </w:rPr>
@@ -3443,7 +3456,6 @@
                 <w:kern w:val="0"/>
                 <w:sz w:val="18"/>
                 <w:szCs w:val="18"/>
-                <w:highlight w:val="yellow"/>
                 <w:lang w:eastAsia="es-CO"/>
                 <w14:ligatures w14:val="none"/>
               </w:rPr>
@@ -3455,7 +3467,6 @@
                 <w:kern w:val="0"/>
                 <w:sz w:val="18"/>
                 <w:szCs w:val="18"/>
-                <w:highlight w:val="yellow"/>
                 <w:lang w:eastAsia="es-CO"/>
                 <w14:ligatures w14:val="none"/>
               </w:rPr>
@@ -3493,7 +3504,6 @@
                 <w:kern w:val="0"/>
                 <w:sz w:val="18"/>
                 <w:szCs w:val="18"/>
-                <w:highlight w:val="yellow"/>
                 <w:lang w:eastAsia="es-CO"/>
                 <w14:ligatures w14:val="none"/>
               </w:rPr>
@@ -3505,7 +3515,6 @@
                 <w:kern w:val="0"/>
                 <w:sz w:val="18"/>
                 <w:szCs w:val="18"/>
-                <w:highlight w:val="yellow"/>
                 <w:lang w:eastAsia="es-CO"/>
                 <w14:ligatures w14:val="none"/>
               </w:rPr>
@@ -3535,7 +3544,6 @@
                 <w:kern w:val="0"/>
                 <w:sz w:val="18"/>
                 <w:szCs w:val="18"/>
-                <w:highlight w:val="yellow"/>
                 <w:lang w:eastAsia="es-CO"/>
                 <w14:ligatures w14:val="none"/>
               </w:rPr>
@@ -3547,7 +3555,6 @@
                 <w:kern w:val="0"/>
                 <w:sz w:val="18"/>
                 <w:szCs w:val="18"/>
-                <w:highlight w:val="yellow"/>
                 <w:lang w:eastAsia="es-CO"/>
                 <w14:ligatures w14:val="none"/>
               </w:rPr>

</xml_diff>